<commit_message>
feat(vt-header): intestazione Word VT identica a ISO 9001 audit report
generateVtTemplate.js:
- Aggiunge Header con tabella 2 righe x 3 colonne:
  Riga 1: [LOGO] | {client} | [LOGO_ORG]
  Riga 2: (vuoto) | VERBALE VT {reportNumber} {reportType} | {inspectionDate}
- Identico layout all'header di ISO9001-audit-report.docx
- [LOGO] e [LOGO_ORG] vengono rimpiazzati dal logo Mason/azienda
  dallo stesso meccanismo di wordExport.js gia' in uso
- Rimossa intestazione 'VERBALE DI CONTROLLO NON DISTRUTTIVO' come
  titolo body (ora e' nell'header sopra le tabelle)
- Margine top aumentato a 1.0in per lasciare spazio all'header

VT-verbale.docx: rigenerato — header verificato:
  ['[LOGO]', '{client}', '[LOGO_ORG]']
  ['', 'VERBALE VT {reportNumber} {reportType}', '{inspectionDate}']

Build: OK (2.60s)

Co-authored-by: QS Studio <marcocamellini@qsstudio241.onmicrosoft.com>
</commit_message>
<xml_diff>
--- a/app/public/templates/VT-verbale.docx
+++ b/app/public/templates/VT-verbale.docx
@@ -2,23 +2,6 @@
 <file path=word/document.xml><?xml version="1.0" encoding="utf-8"?>
 <w:document xmlns:wpc="http://schemas.microsoft.com/office/word/2010/wordprocessingCanvas" xmlns:mc="http://schemas.openxmlformats.org/markup-compatibility/2006" xmlns:o="urn:schemas-microsoft-com:office:office" xmlns:r="http://schemas.openxmlformats.org/officeDocument/2006/relationships" xmlns:m="http://schemas.openxmlformats.org/officeDocument/2006/math" xmlns:v="urn:schemas-microsoft-com:vml" xmlns:wp14="http://schemas.microsoft.com/office/word/2010/wordprocessingDrawing" xmlns:wp="http://schemas.openxmlformats.org/drawingml/2006/wordprocessingDrawing" xmlns:w10="urn:schemas-microsoft-com:office:word" xmlns:w="http://schemas.openxmlformats.org/wordprocessingml/2006/main" xmlns:w14="http://schemas.microsoft.com/office/word/2010/wordml" xmlns:w15="http://schemas.microsoft.com/office/word/2012/wordml" xmlns:wpg="http://schemas.microsoft.com/office/word/2010/wordprocessingGroup" xmlns:wpi="http://schemas.microsoft.com/office/word/2010/wordprocessingInk" xmlns:wne="http://schemas.microsoft.com/office/word/2006/wordml" xmlns:wps="http://schemas.microsoft.com/office/word/2010/wordprocessingShape" xmlns:cx="http://schemas.microsoft.com/office/drawing/2014/chartex" xmlns:cx1="http://schemas.microsoft.com/office/drawing/2015/9/8/chartex" xmlns:cx2="http://schemas.microsoft.com/office/drawing/2015/10/21/chartex" xmlns:cx3="http://schemas.microsoft.com/office/drawing/2016/5/9/chartex" xmlns:cx4="http://schemas.microsoft.com/office/drawing/2016/5/10/chartex" xmlns:cx5="http://schemas.microsoft.com/office/drawing/2016/5/11/chartex" xmlns:cx6="http://schemas.microsoft.com/office/drawing/2016/5/12/chartex" xmlns:cx7="http://schemas.microsoft.com/office/drawing/2016/5/13/chartex" xmlns:cx8="http://schemas.microsoft.com/office/drawing/2016/5/14/chartex" xmlns:aink="http://schemas.microsoft.com/office/drawing/2016/ink" xmlns:am3d="http://schemas.microsoft.com/office/drawing/2017/model3d" xmlns:w16cex="http://schemas.microsoft.com/office/word/2018/wordml/cex" xmlns:w16cid="http://schemas.microsoft.com/office/word/2016/wordml/cid" xmlns:w16="http://schemas.microsoft.com/office/word/2018/wordml" xmlns:w16sdtdh="http://schemas.microsoft.com/office/word/2020/wordml/sdtdatahash" xmlns:w16se="http://schemas.microsoft.com/office/word/2015/wordml/symex" mc:Ignorable="w14 w15 wp14">
   <w:body>
-    <w:p>
-      <w:pPr>
-        <w:spacing w:before="0" w:after="200"/>
-        <w:jc w:val="left"/>
-      </w:pPr>
-      <w:r>
-        <w:rPr>
-          <w:b/>
-          <w:bCs/>
-          <w:color w:val="1F3A5F"/>
-          <w:sz w:val="28"/>
-          <w:szCs w:val="28"/>
-          <w:rFonts w:ascii="Arial" w:cs="Arial" w:eastAsia="Arial" w:hAnsi="Arial"/>
-        </w:rPr>
-        <w:t xml:space="preserve">VERBALE DI CONTROLLO NON DISTRUTTIVO</w:t>
-      </w:r>
-    </w:p>
     <w:tbl>
       <w:tblPr>
         <w:tblW w:type="pct" w:w="100%"/>
@@ -2575,9 +2558,10 @@
       </w:tr>
     </w:tbl>
     <w:sectPr>
-      <w:footerReference w:type="default" r:id="rId6"/>
+      <w:headerReference w:type="default" r:id="rId6"/>
+      <w:footerReference w:type="default" r:id="rId7"/>
       <w:pgSz w:w="11906" w:h="16838" w:orient="portrait"/>
-      <w:pgMar w:top="863" w:right="1152" w:bottom="863" w:left="1152" w:header="708" w:footer="708" w:gutter="0"/>
+      <w:pgMar w:top="1440" w:right="1152" w:bottom="863" w:left="1152" w:header="576" w:footer="708" w:gutter="0"/>
       <w:pgNumType/>
       <w:docGrid w:linePitch="360"/>
     </w:sectPr>
@@ -2749,6 +2733,238 @@
     </w:p>
   </w:footnote>
 </w:footnotes>
+</file>
+
+<file path=word/header1.xml><?xml version="1.0" encoding="utf-8"?>
+<w:hdr xmlns:wpc="http://schemas.microsoft.com/office/word/2010/wordprocessingCanvas" xmlns:mc="http://schemas.openxmlformats.org/markup-compatibility/2006" xmlns:o="urn:schemas-microsoft-com:office:office" xmlns:r="http://schemas.openxmlformats.org/officeDocument/2006/relationships" xmlns:m="http://schemas.openxmlformats.org/officeDocument/2006/math" xmlns:v="urn:schemas-microsoft-com:vml" xmlns:wp14="http://schemas.microsoft.com/office/word/2010/wordprocessingDrawing" xmlns:wp="http://schemas.openxmlformats.org/drawingml/2006/wordprocessingDrawing" xmlns:w10="urn:schemas-microsoft-com:office:word" xmlns:w="http://schemas.openxmlformats.org/wordprocessingml/2006/main" xmlns:w14="http://schemas.microsoft.com/office/word/2010/wordml" xmlns:w15="http://schemas.microsoft.com/office/word/2012/wordml" xmlns:wpg="http://schemas.microsoft.com/office/word/2010/wordprocessingGroup" xmlns:wpi="http://schemas.microsoft.com/office/word/2010/wordprocessingInk" xmlns:wne="http://schemas.microsoft.com/office/word/2006/wordml" xmlns:wps="http://schemas.microsoft.com/office/word/2010/wordprocessingShape" xmlns:cx="http://schemas.microsoft.com/office/drawing/2014/chartex" xmlns:cx1="http://schemas.microsoft.com/office/drawing/2015/9/8/chartex" xmlns:cx2="http://schemas.microsoft.com/office/drawing/2015/10/21/chartex" xmlns:cx3="http://schemas.microsoft.com/office/drawing/2016/5/9/chartex" xmlns:cx4="http://schemas.microsoft.com/office/drawing/2016/5/10/chartex" xmlns:cx5="http://schemas.microsoft.com/office/drawing/2016/5/11/chartex" xmlns:cx6="http://schemas.microsoft.com/office/drawing/2016/5/12/chartex" xmlns:cx7="http://schemas.microsoft.com/office/drawing/2016/5/13/chartex" xmlns:cx8="http://schemas.microsoft.com/office/drawing/2016/5/14/chartex" xmlns:w16cid="http://schemas.microsoft.com/office/word/2016/wordml/cid" xmlns:w16se="http://schemas.microsoft.com/office/word/2015/wordml/symex">
+  <w:tbl>
+    <w:tblPr>
+      <w:tblW w:type="pct" w:w="100%"/>
+      <w:tblBorders>
+        <w:top w:val="none" w:color="FFFFFF" w:sz="0"/>
+        <w:left w:val="none" w:color="FFFFFF" w:sz="0"/>
+        <w:bottom w:val="none" w:color="FFFFFF" w:sz="0"/>
+        <w:right w:val="none" w:color="FFFFFF" w:sz="0"/>
+        <w:insideH w:val="single" w:color="auto" w:sz="4"/>
+        <w:insideV w:val="single" w:color="auto" w:sz="4"/>
+      </w:tblBorders>
+    </w:tblPr>
+    <w:tblGrid>
+      <w:gridCol w:w="100"/>
+      <w:gridCol w:w="100"/>
+      <w:gridCol w:w="100"/>
+    </w:tblGrid>
+    <w:tr>
+      <w:tc>
+        <w:tcPr>
+          <w:tcW w:type="pct" w:w="20%"/>
+          <w:gridSpan w:val="1"/>
+          <w:tcBorders>
+            <w:top w:val="none" w:color="FFFFFF" w:sz="0"/>
+            <w:left w:val="none" w:color="FFFFFF" w:sz="0"/>
+            <w:bottom w:val="none" w:color="FFFFFF" w:sz="0"/>
+            <w:right w:val="none" w:color="FFFFFF" w:sz="0"/>
+          </w:tcBorders>
+          <w:tcMar>
+            <w:top w:type="dxa" w:w="60"/>
+            <w:left w:type="dxa" w:w="80"/>
+            <w:bottom w:type="dxa" w:w="60"/>
+            <w:right w:type="dxa" w:w="80"/>
+          </w:tcMar>
+        </w:tcPr>
+        <w:p>
+          <w:pPr>
+            <w:spacing w:before="0" w:after="80"/>
+            <w:jc w:val="left"/>
+          </w:pPr>
+          <w:r>
+            <w:rPr>
+              <w:b w:val="false"/>
+              <w:bCs w:val="false"/>
+              <w:sz w:val="20"/>
+              <w:szCs w:val="20"/>
+              <w:rFonts w:ascii="Arial" w:cs="Arial" w:eastAsia="Arial" w:hAnsi="Arial"/>
+            </w:rPr>
+            <w:t xml:space="preserve">[LOGO]</w:t>
+          </w:r>
+        </w:p>
+      </w:tc>
+      <w:tc>
+        <w:tcPr>
+          <w:tcW w:type="pct" w:w="60%"/>
+          <w:gridSpan w:val="1"/>
+          <w:tcBorders>
+            <w:top w:val="none" w:color="FFFFFF" w:sz="0"/>
+            <w:left w:val="none" w:color="FFFFFF" w:sz="0"/>
+            <w:bottom w:val="none" w:color="FFFFFF" w:sz="0"/>
+            <w:right w:val="none" w:color="FFFFFF" w:sz="0"/>
+          </w:tcBorders>
+          <w:tcMar>
+            <w:top w:type="dxa" w:w="60"/>
+            <w:left w:type="dxa" w:w="80"/>
+            <w:bottom w:type="dxa" w:w="60"/>
+            <w:right w:type="dxa" w:w="80"/>
+          </w:tcMar>
+        </w:tcPr>
+        <w:p>
+          <w:pPr>
+            <w:spacing w:before="0" w:after="80"/>
+            <w:jc w:val="center"/>
+          </w:pPr>
+          <w:r>
+            <w:rPr>
+              <w:b/>
+              <w:bCs/>
+              <w:color w:val="1F3A5F"/>
+              <w:sz w:val="20"/>
+              <w:szCs w:val="20"/>
+              <w:rFonts w:ascii="Arial" w:cs="Arial" w:eastAsia="Arial" w:hAnsi="Arial"/>
+            </w:rPr>
+            <w:t xml:space="preserve">{client}</w:t>
+          </w:r>
+        </w:p>
+      </w:tc>
+      <w:tc>
+        <w:tcPr>
+          <w:tcW w:type="pct" w:w="20%"/>
+          <w:gridSpan w:val="1"/>
+          <w:tcBorders>
+            <w:top w:val="none" w:color="FFFFFF" w:sz="0"/>
+            <w:left w:val="none" w:color="FFFFFF" w:sz="0"/>
+            <w:bottom w:val="none" w:color="FFFFFF" w:sz="0"/>
+            <w:right w:val="none" w:color="FFFFFF" w:sz="0"/>
+          </w:tcBorders>
+          <w:tcMar>
+            <w:top w:type="dxa" w:w="60"/>
+            <w:left w:type="dxa" w:w="80"/>
+            <w:bottom w:type="dxa" w:w="60"/>
+            <w:right w:type="dxa" w:w="80"/>
+          </w:tcMar>
+        </w:tcPr>
+        <w:p>
+          <w:pPr>
+            <w:spacing w:before="0" w:after="80"/>
+            <w:jc w:val="right"/>
+          </w:pPr>
+          <w:r>
+            <w:rPr>
+              <w:b w:val="false"/>
+              <w:bCs w:val="false"/>
+              <w:sz w:val="20"/>
+              <w:szCs w:val="20"/>
+              <w:rFonts w:ascii="Arial" w:cs="Arial" w:eastAsia="Arial" w:hAnsi="Arial"/>
+            </w:rPr>
+            <w:t xml:space="preserve">[LOGO_ORG]</w:t>
+          </w:r>
+        </w:p>
+      </w:tc>
+    </w:tr>
+    <w:tr>
+      <w:tc>
+        <w:tcPr>
+          <w:tcW w:type="pct" w:w="20%"/>
+          <w:gridSpan w:val="1"/>
+          <w:tcBorders>
+            <w:top w:val="none" w:color="FFFFFF" w:sz="0"/>
+            <w:left w:val="none" w:color="FFFFFF" w:sz="0"/>
+            <w:bottom w:val="none" w:color="FFFFFF" w:sz="0"/>
+            <w:right w:val="none" w:color="FFFFFF" w:sz="0"/>
+          </w:tcBorders>
+          <w:tcMar>
+            <w:top w:type="dxa" w:w="60"/>
+            <w:left w:type="dxa" w:w="80"/>
+            <w:bottom w:type="dxa" w:w="60"/>
+            <w:right w:type="dxa" w:w="80"/>
+          </w:tcMar>
+        </w:tcPr>
+        <w:p>
+          <w:pPr>
+            <w:spacing w:before="0" w:after="80"/>
+            <w:jc w:val="left"/>
+          </w:pPr>
+          <w:r>
+            <w:rPr>
+              <w:b w:val="false"/>
+              <w:bCs w:val="false"/>
+              <w:sz w:val="16"/>
+              <w:szCs w:val="16"/>
+              <w:rFonts w:ascii="Arial" w:cs="Arial" w:eastAsia="Arial" w:hAnsi="Arial"/>
+            </w:rPr>
+          </w:r>
+        </w:p>
+      </w:tc>
+      <w:tc>
+        <w:tcPr>
+          <w:tcW w:type="pct" w:w="60%"/>
+          <w:gridSpan w:val="1"/>
+          <w:tcBorders>
+            <w:top w:val="none" w:color="FFFFFF" w:sz="0"/>
+            <w:left w:val="none" w:color="FFFFFF" w:sz="0"/>
+            <w:bottom w:val="none" w:color="FFFFFF" w:sz="0"/>
+            <w:right w:val="none" w:color="FFFFFF" w:sz="0"/>
+          </w:tcBorders>
+          <w:tcMar>
+            <w:top w:type="dxa" w:w="60"/>
+            <w:left w:type="dxa" w:w="80"/>
+            <w:bottom w:type="dxa" w:w="60"/>
+            <w:right w:type="dxa" w:w="80"/>
+          </w:tcMar>
+        </w:tcPr>
+        <w:p>
+          <w:pPr>
+            <w:spacing w:before="0" w:after="80"/>
+            <w:jc w:val="center"/>
+          </w:pPr>
+          <w:r>
+            <w:rPr>
+              <w:b/>
+              <w:bCs/>
+              <w:color w:val="1F3A5F"/>
+              <w:sz w:val="16"/>
+              <w:szCs w:val="16"/>
+              <w:rFonts w:ascii="Arial" w:cs="Arial" w:eastAsia="Arial" w:hAnsi="Arial"/>
+            </w:rPr>
+            <w:t xml:space="preserve">VERBALE VT {reportNumber} {reportType}</w:t>
+          </w:r>
+        </w:p>
+      </w:tc>
+      <w:tc>
+        <w:tcPr>
+          <w:tcW w:type="pct" w:w="20%"/>
+          <w:gridSpan w:val="1"/>
+          <w:tcBorders>
+            <w:top w:val="none" w:color="FFFFFF" w:sz="0"/>
+            <w:left w:val="none" w:color="FFFFFF" w:sz="0"/>
+            <w:bottom w:val="none" w:color="FFFFFF" w:sz="0"/>
+            <w:right w:val="none" w:color="FFFFFF" w:sz="0"/>
+          </w:tcBorders>
+          <w:tcMar>
+            <w:top w:type="dxa" w:w="60"/>
+            <w:left w:type="dxa" w:w="80"/>
+            <w:bottom w:type="dxa" w:w="60"/>
+            <w:right w:type="dxa" w:w="80"/>
+          </w:tcMar>
+        </w:tcPr>
+        <w:p>
+          <w:pPr>
+            <w:spacing w:before="0" w:after="80"/>
+            <w:jc w:val="right"/>
+          </w:pPr>
+          <w:r>
+            <w:rPr>
+              <w:b w:val="false"/>
+              <w:bCs w:val="false"/>
+              <w:sz w:val="16"/>
+              <w:szCs w:val="16"/>
+              <w:rFonts w:ascii="Arial" w:cs="Arial" w:eastAsia="Arial" w:hAnsi="Arial"/>
+            </w:rPr>
+            <w:t xml:space="preserve">{inspectionDate}</w:t>
+          </w:r>
+        </w:p>
+      </w:tc>
+    </w:tr>
+  </w:tbl>
+</w:hdr>
 </file>
 
 <file path=word/numbering.xml><?xml version="1.0" encoding="utf-8"?>

</xml_diff>

<commit_message>
feat(vt-supplier): campo 'Fornitore ispezionato' + spiegazione scenario
Scenario: Mason (studio) -> Manitou (cliente) -> Fornitore1 (ispezione fisica)

Migration 109: ndt_reports.supplier_name NVARCHAR(200) NULL

Backend ndtReports.controller.js:
- supplier_name incluso in CREATE, UPDATE, GET

Frontend NdtReportsPage.jsx:
- Nuovo campo 'Fornitore ispezionato (stabilimento dove si va)'
  con placeholder es. 'Fornitore1 S.r.l. — Via Roma 1, Milano'
- Nota contestuale blu: 'Cliente = chi commissiona. Fornitore = dove si va.'
- Campo supplier_name nell'emptyForm e init isEdit

vtWordExport.js:
- supplierName: nd(report.supplier_name) aggiunto ai dati template

generateVtTemplate.js + VT-verbale.docx:
- Riga 'FORNITORE ISPEZIONATO / Supplier: {supplierName}'
  aggiunta nell'intestazione tra Commessa e Specifica WPS

Build: OK (3.14s) | Migrazione 109 prod OK | Backend healthy

Co-authored-by: QS Studio <marcocamellini@qsstudio241.onmicrosoft.com>
</commit_message>
<xml_diff>
--- a/app/public/templates/VT-verbale.docx
+++ b/app/public/templates/VT-verbale.docx
@@ -344,6 +344,70 @@
                 <w:rFonts w:ascii="Arial" w:cs="Arial" w:eastAsia="Arial" w:hAnsi="Arial"/>
               </w:rPr>
               <w:t xml:space="preserve">{inspectionDate}</w:t>
+            </w:r>
+          </w:p>
+        </w:tc>
+      </w:tr>
+      <w:tr>
+        <w:tc>
+          <w:tcPr>
+            <w:tcW w:type="pct" w:w="15%"/>
+            <w:gridSpan w:val="1"/>
+            <w:tcBorders>
+              <w:top w:val="single" w:color="000000" w:sz="1"/>
+              <w:left w:val="single" w:color="000000" w:sz="1"/>
+              <w:bottom w:val="single" w:color="000000" w:sz="1"/>
+              <w:right w:val="single" w:color="000000" w:sz="1"/>
+            </w:tcBorders>
+            <w:shd w:fill="F3F4F6" w:val="clear"/>
+            <w:tcMar>
+              <w:top w:type="dxa" w:w="60"/>
+              <w:left w:type="dxa" w:w="80"/>
+              <w:bottom w:type="dxa" w:w="60"/>
+              <w:right w:type="dxa" w:w="80"/>
+            </w:tcMar>
+          </w:tcPr>
+          <w:p>
+            <w:pPr>
+              <w:spacing w:before="0" w:after="80"/>
+              <w:jc w:val="left"/>
+            </w:pPr>
+            <w:r>
+              <w:rPr>
+                <w:b/>
+                <w:bCs/>
+                <w:sz w:val="18"/>
+                <w:szCs w:val="18"/>
+                <w:rFonts w:ascii="Arial" w:cs="Arial" w:eastAsia="Arial" w:hAnsi="Arial"/>
+              </w:rPr>
+              <w:t xml:space="preserve">FORNITORE ISPEZIONATO / Supplier</w:t>
+            </w:r>
+          </w:p>
+        </w:tc>
+        <w:tc>
+          <w:tcPr>
+            <w:gridSpan w:val="3"/>
+            <w:tcMar>
+              <w:top w:type="dxa" w:w="60"/>
+              <w:left w:type="dxa" w:w="80"/>
+              <w:bottom w:type="dxa" w:w="60"/>
+              <w:right w:type="dxa" w:w="80"/>
+            </w:tcMar>
+          </w:tcPr>
+          <w:p>
+            <w:pPr>
+              <w:spacing w:before="0" w:after="80"/>
+              <w:jc w:val="left"/>
+            </w:pPr>
+            <w:r>
+              <w:rPr>
+                <w:b w:val="false"/>
+                <w:bCs w:val="false"/>
+                <w:sz w:val="20"/>
+                <w:szCs w:val="20"/>
+                <w:rFonts w:ascii="Arial" w:cs="Arial" w:eastAsia="Arial" w:hAnsi="Arial"/>
+              </w:rPr>
+              <w:t xml:space="preserve">{supplierName}</w:t>
             </w:r>
           </w:p>
         </w:tc>

</xml_diff>